<commit_message>
Add Exhibit 13: OT/ICS Intrusion Detection – 100% recall on HAI turbine
</commit_message>
<xml_diff>
--- a/exhibits/Exhibit11_RegMap_Project.docx
+++ b/exhibits/Exhibit11_RegMap_Project.docx
@@ -462,7 +462,7 @@
           <w:noProof/>
         </w:rPr>
         <w:drawing>
-          <wp:inline distT="0" distB="0" distL="0" distR="0" wp14:anchorId="5731E3CB" wp14:editId="347F0725">
+          <wp:inline distT="0" distB="0" distL="0" distR="0" wp14:anchorId="5731E3CB" wp14:editId="11F59B1C">
             <wp:extent cx="3352800" cy="2468392"/>
             <wp:effectExtent l="0" t="0" r="0" b="8255"/>
             <wp:docPr id="1218683355" name="Picture 1"/>
@@ -557,7 +557,7 @@
           <w:noProof/>
         </w:rPr>
         <w:drawing>
-          <wp:inline distT="0" distB="0" distL="0" distR="0" wp14:anchorId="52C9AC83" wp14:editId="17BFCF43">
+          <wp:inline distT="0" distB="0" distL="0" distR="0" wp14:anchorId="52C9AC83" wp14:editId="7B233D5A">
             <wp:extent cx="3846433" cy="3015916"/>
             <wp:effectExtent l="0" t="0" r="1905" b="0"/>
             <wp:docPr id="1258047217" name="Picture 2"/>
@@ -642,6 +642,45 @@
     </w:p>
     <w:p>
       <w:r>
+        <w:drawing>
+          <wp:inline distT="0" distB="0" distL="0" distR="0" wp14:anchorId="3708F042" wp14:editId="57EC4C05">
+            <wp:extent cx="5943600" cy="3194685"/>
+            <wp:effectExtent l="0" t="0" r="0" b="5715"/>
+            <wp:docPr id="2098851177" name="Picture 1"/>
+            <wp:cNvGraphicFramePr>
+              <a:graphicFrameLocks xmlns:a="http://schemas.openxmlformats.org/drawingml/2006/main" noChangeAspect="1"/>
+            </wp:cNvGraphicFramePr>
+            <a:graphic xmlns:a="http://schemas.openxmlformats.org/drawingml/2006/main">
+              <a:graphicData uri="http://schemas.openxmlformats.org/drawingml/2006/picture">
+                <pic:pic xmlns:pic="http://schemas.openxmlformats.org/drawingml/2006/picture">
+                  <pic:nvPicPr>
+                    <pic:cNvPr id="2098851177" name=""/>
+                    <pic:cNvPicPr/>
+                  </pic:nvPicPr>
+                  <pic:blipFill>
+                    <a:blip r:embed="rId6"/>
+                    <a:stretch>
+                      <a:fillRect/>
+                    </a:stretch>
+                  </pic:blipFill>
+                  <pic:spPr>
+                    <a:xfrm>
+                      <a:off x="0" y="0"/>
+                      <a:ext cx="5943600" cy="3194685"/>
+                    </a:xfrm>
+                    <a:prstGeom prst="rect">
+                      <a:avLst/>
+                    </a:prstGeom>
+                  </pic:spPr>
+                </pic:pic>
+              </a:graphicData>
+            </a:graphic>
+          </wp:inline>
+        </w:drawing>
+      </w:r>
+    </w:p>
+    <w:p>
+      <w:r>
         <w:t>![</w:t>
       </w:r>
       <w:proofErr w:type="spellStart"/>
@@ -650,17 +689,12 @@
       </w:r>
       <w:proofErr w:type="spellEnd"/>
       <w:r>
-        <w:t xml:space="preserve"> demo]</w:t>
-      </w:r>
-      <w:r>
-        <w:t xml:space="preserve"> </w:t>
-      </w:r>
-      <w:r>
-        <w:t xml:space="preserve">(Exhibit11c_demo_interface.png)  </w:t>
-      </w:r>
-    </w:p>
-    <w:p>
-      <w:r>
+        <w:t xml:space="preserve"> demo] (Exhibit11c_demo_interface.png)  </w:t>
+      </w:r>
+    </w:p>
+    <w:p>
+      <w:r>
+        <w:lastRenderedPageBreak/>
         <w:t>Caption: A web</w:t>
       </w:r>
       <w:r>
@@ -690,7 +724,45 @@
         <w:t>.</w:t>
       </w:r>
     </w:p>
-    <w:p/>
+    <w:p>
+      <w:r>
+        <w:drawing>
+          <wp:inline distT="0" distB="0" distL="0" distR="0" wp14:anchorId="6F456DD6" wp14:editId="448E4AAC">
+            <wp:extent cx="5943600" cy="3194685"/>
+            <wp:effectExtent l="0" t="0" r="0" b="5715"/>
+            <wp:docPr id="1869821103" name="Picture 1"/>
+            <wp:cNvGraphicFramePr>
+              <a:graphicFrameLocks xmlns:a="http://schemas.openxmlformats.org/drawingml/2006/main" noChangeAspect="1"/>
+            </wp:cNvGraphicFramePr>
+            <a:graphic xmlns:a="http://schemas.openxmlformats.org/drawingml/2006/main">
+              <a:graphicData uri="http://schemas.openxmlformats.org/drawingml/2006/picture">
+                <pic:pic xmlns:pic="http://schemas.openxmlformats.org/drawingml/2006/picture">
+                  <pic:nvPicPr>
+                    <pic:cNvPr id="1869821103" name=""/>
+                    <pic:cNvPicPr/>
+                  </pic:nvPicPr>
+                  <pic:blipFill>
+                    <a:blip r:embed="rId7"/>
+                    <a:stretch>
+                      <a:fillRect/>
+                    </a:stretch>
+                  </pic:blipFill>
+                  <pic:spPr>
+                    <a:xfrm>
+                      <a:off x="0" y="0"/>
+                      <a:ext cx="5943600" cy="3194685"/>
+                    </a:xfrm>
+                    <a:prstGeom prst="rect">
+                      <a:avLst/>
+                    </a:prstGeom>
+                  </pic:spPr>
+                </pic:pic>
+              </a:graphicData>
+            </a:graphic>
+          </wp:inline>
+        </w:drawing>
+      </w:r>
+    </w:p>
     <w:p/>
     <w:p/>
     <w:p>
@@ -726,7 +798,6 @@
     </w:p>
     <w:p>
       <w:r>
-        <w:lastRenderedPageBreak/>
         <w:t>- Published the code and model openly, fulfilling my stated goal of making results accessible to the broader U.S. security community.</w:t>
       </w:r>
     </w:p>
@@ -763,10 +834,7 @@
     <w:p/>
     <w:p>
       <w:r>
-        <w:t xml:space="preserve">Date: </w:t>
-      </w:r>
-      <w:r>
-        <w:t>6/23/2026</w:t>
+        <w:t>Date: 6/23/2026</w:t>
       </w:r>
     </w:p>
     <w:p>

</xml_diff>

<commit_message>
Deep audit fixes: README, gitignore, notebook corrections, cleanup
- README.md: full rewrite with results tables, tech stack, project structure
- .gitignore: add ~$* and ~*.tmp to block Word temp files
- notebooks/03b: fix Polars deprecation (replace -> replace_strict)
- notebooks/04: tqdm progress bars in all cells, diagonal_relaxed concat fix
- exhibits: add Exhibit 13 content, remove old PNG screenshots and temp files
- notebooks: remove non-working notebook drafts
</commit_message>
<xml_diff>
--- a/exhibits/Exhibit11_RegMap_Project.docx
+++ b/exhibits/Exhibit11_RegMap_Project.docx
@@ -4,15 +4,7 @@
   <w:body>
     <w:p>
       <w:r>
-        <w:t xml:space="preserve"> Exhibit 11: </w:t>
-      </w:r>
-      <w:proofErr w:type="spellStart"/>
-      <w:r>
-        <w:t>RegMap</w:t>
-      </w:r>
-      <w:proofErr w:type="spellEnd"/>
-      <w:r>
-        <w:t xml:space="preserve"> – Automated Compliance Validation Framework</w:t>
+        <w:t xml:space="preserve"> Exhibit 11: RegMap – Automated Compliance Validation Framework</w:t>
       </w:r>
     </w:p>
     <w:p/>
@@ -34,13 +26,8 @@
     </w:p>
     <w:p/>
     <w:p>
-      <w:proofErr w:type="spellStart"/>
-      <w:r>
-        <w:t>RegMap</w:t>
-      </w:r>
-      <w:proofErr w:type="spellEnd"/>
-      <w:r>
-        <w:t xml:space="preserve"> is a working prototype of an AI</w:t>
+      <w:r>
+        <w:t>RegMap is a working prototype of an AI</w:t>
       </w:r>
       <w:r>
         <w:rPr>
@@ -106,15 +93,7 @@
     <w:p/>
     <w:p>
       <w:r>
-        <w:t xml:space="preserve">In my personal statement, I identified a “pervasive inefficiency”: the manual mapping of technical security controls to regulatory subparts. </w:t>
-      </w:r>
-      <w:proofErr w:type="spellStart"/>
-      <w:r>
-        <w:t>RegMap</w:t>
-      </w:r>
-      <w:proofErr w:type="spellEnd"/>
-      <w:r>
-        <w:t xml:space="preserve"> addresses this by:</w:t>
+        <w:t>In my personal statement, I identified a “pervasive inefficiency”: the manual mapping of technical security controls to regulatory subparts. RegMap addresses this by:</w:t>
       </w:r>
     </w:p>
     <w:p/>
@@ -299,6 +278,126 @@
       </w:r>
       <w:r>
         <w:t>Out Test Set</w:t>
+      </w:r>
+    </w:p>
+    <w:p>
+      <w:pPr>
+        <w:spacing w:after="0" w:line="240" w:lineRule="auto"/>
+        <w:rPr>
+          <w:rFonts w:ascii="Consolas" w:eastAsia="Times New Roman" w:hAnsi="Consolas" w:cs="Times New Roman"/>
+          <w:color w:val="3B3B3B"/>
+          <w:kern w:val="0"/>
+          <w:sz w:val="21"/>
+          <w:szCs w:val="21"/>
+          <w14:ligatures w14:val="none"/>
+        </w:rPr>
+      </w:pPr>
+      <w:r>
+        <w:rPr>
+          <w:rFonts w:ascii="Consolas" w:eastAsia="Times New Roman" w:hAnsi="Consolas" w:cs="Times New Roman"/>
+          <w:color w:val="3B3B3B"/>
+          <w:kern w:val="0"/>
+          <w:sz w:val="21"/>
+          <w:szCs w:val="21"/>
+          <w14:ligatures w14:val="none"/>
+        </w:rPr>
+        <w:t>Test queries evaluated: 34</w:t>
+      </w:r>
+    </w:p>
+    <w:p>
+      <w:pPr>
+        <w:spacing w:after="0" w:line="240" w:lineRule="auto"/>
+        <w:rPr>
+          <w:rFonts w:ascii="Consolas" w:eastAsia="Times New Roman" w:hAnsi="Consolas" w:cs="Times New Roman"/>
+          <w:color w:val="3B3B3B"/>
+          <w:kern w:val="0"/>
+          <w:sz w:val="21"/>
+          <w:szCs w:val="21"/>
+          <w14:ligatures w14:val="none"/>
+        </w:rPr>
+      </w:pPr>
+      <w:r>
+        <w:rPr>
+          <w:rFonts w:ascii="Consolas" w:eastAsia="Times New Roman" w:hAnsi="Consolas" w:cs="Times New Roman"/>
+          <w:color w:val="3B3B3B"/>
+          <w:kern w:val="0"/>
+          <w:sz w:val="21"/>
+          <w:szCs w:val="21"/>
+          <w14:ligatures w14:val="none"/>
+        </w:rPr>
+        <w:t>Corpus size (HIPAA provisions): 60</w:t>
+      </w:r>
+    </w:p>
+    <w:p>
+      <w:pPr>
+        <w:spacing w:after="0" w:line="240" w:lineRule="auto"/>
+        <w:rPr>
+          <w:rFonts w:ascii="Consolas" w:eastAsia="Times New Roman" w:hAnsi="Consolas" w:cs="Times New Roman"/>
+          <w:color w:val="3B3B3B"/>
+          <w:kern w:val="0"/>
+          <w:sz w:val="21"/>
+          <w:szCs w:val="21"/>
+          <w14:ligatures w14:val="none"/>
+        </w:rPr>
+      </w:pPr>
+      <w:r>
+        <w:rPr>
+          <w:rFonts w:ascii="Consolas" w:eastAsia="Times New Roman" w:hAnsi="Consolas" w:cs="Times New Roman"/>
+          <w:color w:val="3B3B3B"/>
+          <w:kern w:val="0"/>
+          <w:sz w:val="21"/>
+          <w:szCs w:val="21"/>
+          <w14:ligatures w14:val="none"/>
+        </w:rPr>
+        <w:t>Recall@1: 0.2647</w:t>
+      </w:r>
+    </w:p>
+    <w:p>
+      <w:pPr>
+        <w:spacing w:after="0" w:line="240" w:lineRule="auto"/>
+        <w:rPr>
+          <w:rFonts w:ascii="Consolas" w:eastAsia="Times New Roman" w:hAnsi="Consolas" w:cs="Times New Roman"/>
+          <w:color w:val="3B3B3B"/>
+          <w:kern w:val="0"/>
+          <w:sz w:val="21"/>
+          <w:szCs w:val="21"/>
+          <w14:ligatures w14:val="none"/>
+        </w:rPr>
+      </w:pPr>
+      <w:r>
+        <w:rPr>
+          <w:rFonts w:ascii="Consolas" w:eastAsia="Times New Roman" w:hAnsi="Consolas" w:cs="Times New Roman"/>
+          <w:color w:val="3B3B3B"/>
+          <w:kern w:val="0"/>
+          <w:sz w:val="21"/>
+          <w:szCs w:val="21"/>
+          <w14:ligatures w14:val="none"/>
+        </w:rPr>
+        <w:t>Recall@3: 0.5588</w:t>
+      </w:r>
+    </w:p>
+    <w:p>
+      <w:pPr>
+        <w:spacing w:after="0" w:line="240" w:lineRule="auto"/>
+        <w:rPr>
+          <w:rFonts w:ascii="Consolas" w:eastAsia="Times New Roman" w:hAnsi="Consolas" w:cs="Times New Roman"/>
+          <w:color w:val="3B3B3B"/>
+          <w:kern w:val="0"/>
+          <w:sz w:val="21"/>
+          <w:szCs w:val="21"/>
+          <w14:ligatures w14:val="none"/>
+        </w:rPr>
+      </w:pPr>
+      <w:r>
+        <w:rPr>
+          <w:rFonts w:ascii="Consolas" w:eastAsia="Times New Roman" w:hAnsi="Consolas" w:cs="Times New Roman"/>
+          <w:color w:val="3B3B3B"/>
+          <w:kern w:val="0"/>
+          <w:sz w:val="21"/>
+          <w:szCs w:val="21"/>
+          <w14:ligatures w14:val="none"/>
+        </w:rPr>
+        <w:t>Recall@5: 0.7353</w:t>
       </w:r>
     </w:p>
     <w:p>
@@ -311,33 +410,44 @@
       </w:pPr>
       <w:r>
         <w:rPr>
+          <w:rFonts w:ascii="Consolas" w:eastAsia="Times New Roman" w:hAnsi="Consolas" w:cs="Times New Roman"/>
+          <w:color w:val="3B3B3B"/>
+          <w:kern w:val="0"/>
+          <w:sz w:val="21"/>
+          <w:szCs w:val="21"/>
+          <w14:ligatures w14:val="none"/>
+        </w:rPr>
+        <w:t>MRR:      0.4631</w:t>
+      </w:r>
+    </w:p>
+    <w:p>
+      <w:pPr>
+        <w:rPr>
           <w:rFonts w:ascii="Segoe UI" w:hAnsi="Segoe UI" w:cs="Segoe UI"/>
           <w:color w:val="0F1115"/>
           <w:shd w:val="clear" w:color="auto" w:fill="FFFFFF"/>
         </w:rPr>
-        <w:t>Test queries evaluated: 6</w:t>
-      </w:r>
-      <w:r>
-        <w:rPr>
-          <w:rFonts w:ascii="Segoe UI" w:hAnsi="Segoe UI" w:cs="Segoe UI"/>
-          <w:color w:val="0F1115"/>
-        </w:rPr>
-        <w:br/>
-      </w:r>
-      <w:r>
+      </w:pPr>
+    </w:p>
+    <w:p>
+      <w:pPr>
         <w:rPr>
           <w:rFonts w:ascii="Segoe UI" w:hAnsi="Segoe UI" w:cs="Segoe UI"/>
           <w:color w:val="0F1115"/>
           <w:shd w:val="clear" w:color="auto" w:fill="FFFFFF"/>
         </w:rPr>
-        <w:t>Recall@1: 0.1667</w:t>
-      </w:r>
-      <w:r>
-        <w:rPr>
-          <w:rFonts w:ascii="Segoe UI" w:hAnsi="Segoe UI" w:cs="Segoe UI"/>
-          <w:color w:val="0F1115"/>
-        </w:rPr>
-        <w:br/>
+      </w:pPr>
+      <w:r>
+        <w:t>Figure: Evaluation metrics from the fine</w:t>
+      </w:r>
+      <w:r>
+        <w:rPr>
+          <w:rFonts w:ascii="Cambria Math" w:hAnsi="Cambria Math" w:cs="Cambria Math"/>
+        </w:rPr>
+        <w:t>‑</w:t>
+      </w:r>
+      <w:r>
+        <w:t xml:space="preserve">tuned model. </w:t>
       </w:r>
       <w:r>
         <w:rPr>
@@ -345,14 +455,7 @@
           <w:color w:val="0F1115"/>
           <w:shd w:val="clear" w:color="auto" w:fill="FFFFFF"/>
         </w:rPr>
-        <w:t>Recall@3: 0.5000</w:t>
-      </w:r>
-      <w:r>
-        <w:rPr>
-          <w:rFonts w:ascii="Segoe UI" w:hAnsi="Segoe UI" w:cs="Segoe UI"/>
-          <w:color w:val="0F1115"/>
-        </w:rPr>
-        <w:br/>
+        <w:t>T</w:t>
       </w:r>
       <w:r>
         <w:rPr>
@@ -360,63 +463,7 @@
           <w:color w:val="0F1115"/>
           <w:shd w:val="clear" w:color="auto" w:fill="FFFFFF"/>
         </w:rPr>
-        <w:t>Recall@5: 1.0000</w:t>
-      </w:r>
-      <w:r>
-        <w:rPr>
-          <w:rFonts w:ascii="Segoe UI" w:hAnsi="Segoe UI" w:cs="Segoe UI"/>
-          <w:color w:val="0F1115"/>
-        </w:rPr>
-        <w:br/>
-      </w:r>
-      <w:r>
-        <w:rPr>
-          <w:rFonts w:ascii="Segoe UI" w:hAnsi="Segoe UI" w:cs="Segoe UI"/>
-          <w:color w:val="0F1115"/>
-          <w:shd w:val="clear" w:color="auto" w:fill="FFFFFF"/>
-        </w:rPr>
-        <w:t>MRR: 0.3944</w:t>
-      </w:r>
-    </w:p>
-    <w:p>
-      <w:pPr>
-        <w:rPr>
-          <w:rFonts w:ascii="Segoe UI" w:hAnsi="Segoe UI" w:cs="Segoe UI"/>
-          <w:color w:val="0F1115"/>
-          <w:shd w:val="clear" w:color="auto" w:fill="FFFFFF"/>
-        </w:rPr>
-      </w:pPr>
-    </w:p>
-    <w:p>
-      <w:pPr>
-        <w:rPr>
-          <w:rFonts w:ascii="Segoe UI" w:hAnsi="Segoe UI" w:cs="Segoe UI"/>
-          <w:color w:val="0F1115"/>
-          <w:shd w:val="clear" w:color="auto" w:fill="FFFFFF"/>
-        </w:rPr>
-      </w:pPr>
-    </w:p>
-    <w:p>
-      <w:r>
-        <w:t>Figure: Evaluation metrics from the fine</w:t>
-      </w:r>
-      <w:r>
-        <w:rPr>
-          <w:rFonts w:ascii="Cambria Math" w:hAnsi="Cambria Math" w:cs="Cambria Math"/>
-        </w:rPr>
-        <w:t>‑</w:t>
-      </w:r>
-      <w:r>
-        <w:t>tuned model. Recall@5 = 1.0 indicates that the correct HIPAA citation was always present in the top</w:t>
-      </w:r>
-      <w:r>
-        <w:rPr>
-          <w:rFonts w:ascii="Cambria Math" w:hAnsi="Cambria Math" w:cs="Cambria Math"/>
-        </w:rPr>
-        <w:t>‑</w:t>
-      </w:r>
-      <w:r>
-        <w:t>5 retrieved results.</w:t>
+        <w:t>he model achieves a Recall@5 of 0.74, meaning the correct HIPAA citation appears among the top five results 74% of the time on the held-out test set.</w:t>
       </w:r>
     </w:p>
     <w:p/>
@@ -462,7 +509,7 @@
           <w:noProof/>
         </w:rPr>
         <w:drawing>
-          <wp:inline distT="0" distB="0" distL="0" distR="0" wp14:anchorId="5731E3CB" wp14:editId="11F59B1C">
+          <wp:inline distT="0" distB="0" distL="0" distR="0" wp14:anchorId="5731E3CB" wp14:editId="4586F911">
             <wp:extent cx="3352800" cy="2468392"/>
             <wp:effectExtent l="0" t="0" r="0" b="8255"/>
             <wp:docPr id="1218683355" name="Picture 1"/>
@@ -540,15 +587,7 @@
     <w:p>
       <w:r>
         <w:lastRenderedPageBreak/>
-        <w:t xml:space="preserve"> 4.2 </w:t>
-      </w:r>
-      <w:proofErr w:type="spellStart"/>
-      <w:r>
-        <w:t>Jupyter</w:t>
-      </w:r>
-      <w:proofErr w:type="spellEnd"/>
-      <w:r>
-        <w:t xml:space="preserve"> Notebook Overview</w:t>
+        <w:t xml:space="preserve"> 4.2 Jupyter Notebook Overview</w:t>
       </w:r>
     </w:p>
     <w:p>
@@ -557,7 +596,7 @@
           <w:noProof/>
         </w:rPr>
         <w:drawing>
-          <wp:inline distT="0" distB="0" distL="0" distR="0" wp14:anchorId="52C9AC83" wp14:editId="7B233D5A">
+          <wp:inline distT="0" distB="0" distL="0" distR="0" wp14:anchorId="52C9AC83" wp14:editId="322EB949">
             <wp:extent cx="3846433" cy="3015916"/>
             <wp:effectExtent l="0" t="0" r="1905" b="0"/>
             <wp:docPr id="1258047217" name="Picture 2"/>
@@ -642,6 +681,9 @@
     </w:p>
     <w:p>
       <w:r>
+        <w:rPr>
+          <w:noProof/>
+        </w:rPr>
         <w:drawing>
           <wp:inline distT="0" distB="0" distL="0" distR="0" wp14:anchorId="3708F042" wp14:editId="57EC4C05">
             <wp:extent cx="5943600" cy="3194685"/>
@@ -681,15 +723,7 @@
     </w:p>
     <w:p>
       <w:r>
-        <w:t>![</w:t>
-      </w:r>
-      <w:proofErr w:type="spellStart"/>
-      <w:r>
-        <w:t>Streamlit</w:t>
-      </w:r>
-      <w:proofErr w:type="spellEnd"/>
-      <w:r>
-        <w:t xml:space="preserve"> demo] (Exhibit11c_demo_interface.png)  </w:t>
+        <w:t xml:space="preserve">![Streamlit demo] (Exhibit11c_demo_interface.png)  </w:t>
       </w:r>
     </w:p>
     <w:p>
@@ -713,19 +747,14 @@
         <w:t>‑</w:t>
       </w:r>
       <w:r>
-        <w:t xml:space="preserve">5 matching HIPAA citations with similarity scores. Built with </w:t>
-      </w:r>
-      <w:proofErr w:type="spellStart"/>
-      <w:r>
-        <w:t>Streamlit</w:t>
-      </w:r>
-      <w:proofErr w:type="spellEnd"/>
-      <w:r>
-        <w:t>.</w:t>
-      </w:r>
-    </w:p>
-    <w:p>
-      <w:r>
+        <w:t>5 matching HIPAA citations with similarity scores. Built with Streamlit.</w:t>
+      </w:r>
+    </w:p>
+    <w:p>
+      <w:r>
+        <w:rPr>
+          <w:noProof/>
+        </w:rPr>
         <w:drawing>
           <wp:inline distT="0" distB="0" distL="0" distR="0" wp14:anchorId="6F456DD6" wp14:editId="448E4AAC">
             <wp:extent cx="5943600" cy="3194685"/>
@@ -809,15 +838,7 @@
     <w:p/>
     <w:p>
       <w:r>
-        <w:t xml:space="preserve">The existence of </w:t>
-      </w:r>
-      <w:proofErr w:type="spellStart"/>
-      <w:r>
-        <w:t>RegMap</w:t>
-      </w:r>
-      <w:proofErr w:type="spellEnd"/>
-      <w:r>
-        <w:t>, together with my academic publications and professional experience, leaves no doubt that I am well positioned to execute the full proposed endeavor without the need for an employer</w:t>
+        <w:t>The existence of RegMap, together with my academic publications and professional experience, leaves no doubt that I am well positioned to execute the full proposed endeavor without the need for an employer</w:t>
       </w:r>
       <w:r>
         <w:rPr>
@@ -1792,6 +1813,17 @@
       <w:shd w:val="clear" w:color="auto" w:fill="E1DFDD"/>
     </w:rPr>
   </w:style>
+  <w:style w:type="character" w:styleId="Emphasis">
+    <w:name w:val="Emphasis"/>
+    <w:basedOn w:val="DefaultParagraphFont"/>
+    <w:uiPriority w:val="20"/>
+    <w:qFormat/>
+    <w:rsid w:val="007B0B2F"/>
+    <w:rPr>
+      <w:i/>
+      <w:iCs/>
+    </w:rPr>
+  </w:style>
 </w:styles>
 </file>
 

</xml_diff>